<commit_message>
Restore Assessment 5 OG document templates
</commit_message>
<xml_diff>
--- a/unit-4/assessment-5-deep-learning-training-project/Unit 4 Assessment 5 - Answer Sheet - Rob Johnston.docx
+++ b/unit-4/assessment-5-deep-learning-training-project/Unit 4 Assessment 5 - Answer Sheet - Rob Johnston.docx
@@ -4,143 +4,364 @@
   <w:body>
     <w:p>
       <w:pPr>
-        <w:jc w:val="left"/>
+        <w:spacing w:after="120"/>
       </w:pPr>
       <w:r>
-        <w:drawing>
-          <wp:inline xmlns:a="http://schemas.openxmlformats.org/drawingml/2006/main" xmlns:pic="http://schemas.openxmlformats.org/drawingml/2006/picture">
-            <wp:extent cx="1325880" cy="643786"/>
-            <wp:docPr id="1" name="Picture 1"/>
-            <wp:cNvGraphicFramePr>
-              <a:graphicFrameLocks noChangeAspect="1"/>
-            </wp:cNvGraphicFramePr>
-            <a:graphic>
-              <a:graphicData uri="http://schemas.openxmlformats.org/drawingml/2006/picture">
-                <pic:pic>
-                  <pic:nvPicPr>
-                    <pic:cNvPr id="0" name="og_header.png"/>
-                    <pic:cNvPicPr/>
-                  </pic:nvPicPr>
-                  <pic:blipFill>
-                    <a:blip r:embed="rId9"/>
-                    <a:stretch>
-                      <a:fillRect/>
-                    </a:stretch>
-                  </pic:blipFill>
-                  <pic:spPr>
-                    <a:xfrm>
-                      <a:off x="0" y="0"/>
-                      <a:ext cx="1325880" cy="643786"/>
-                    </a:xfrm>
-                    <a:prstGeom prst="rect"/>
-                  </pic:spPr>
-                </pic:pic>
-              </a:graphicData>
-            </a:graphic>
-          </wp:inline>
-        </w:drawing>
+        <w:t>Website design / build / hosting</w:t>
       </w:r>
     </w:p>
     <w:p>
       <w:pPr>
-        <w:jc w:val="center"/>
+        <w:spacing w:after="120"/>
       </w:pPr>
       <w:r>
-        <w:rPr>
-          <w:b/>
-          <w:color w:val="06763D"/>
-          <w:sz w:val="32"/>
-        </w:rPr>
         <w:t>Unit 4 Assessment 5 - Answer Sheet</w:t>
       </w:r>
     </w:p>
     <w:p>
+      <w:pPr>
+        <w:spacing w:after="120"/>
+      </w:pPr>
       <w:r>
-        <w:t>Rob Johnston | TQUK Level 3 Certificate in AI Programming with Python | Unit 4 Lesson 5</w:t>
+        <w:t>Rob Johnston | TQUK Level 3 Certificate in AI Programming with Python</w:t>
       </w:r>
     </w:p>
     <w:p>
       <w:pPr>
-        <w:pStyle w:val="Heading1"/>
+        <w:spacing w:after="120"/>
       </w:pPr>
       <w:r>
-        <w:t>Question 1</w:t>
+        <w:t>Deep Learning - Training, Validation Tuning and Inference</w:t>
       </w:r>
     </w:p>
     <w:p>
       <w:r>
-        <w:t>Create evidence which demonstrates two ways to train a deep learning model, the use of a validation set for hyperparameter tuning, and how to use deep learning for inference.</w:t>
+        <w:t>Q1. Create evidence which demonstrates two ways to train a deep learning model, the use of a validation set for hyperparameter tuning, and how to use deep learning for inference.</w:t>
       </w:r>
     </w:p>
     <w:p>
       <w:pPr>
-        <w:pStyle w:val="Heading2"/>
+        <w:spacing w:after="120"/>
       </w:pPr>
       <w:r>
-        <w:t>Answer</w:t>
+        <w:t>This submission uses the Iris dataset as the assessment data source. The Iris data is loaded through sklearn.datasets.load_iris and gives four numerical input features for three target classes: setosa, versicolor and virginica. This keeps the answer focused on the course assessment task and avoids using unrelated private project data.</w:t>
+      </w:r>
+    </w:p>
+    <w:p>
+      <w:pPr>
+        <w:spacing w:before="40" w:after="160"/>
+        <w:jc w:val="center"/>
+      </w:pPr>
+      <w:r>
+        <w:t>For criterion 3.1, I demonstrate two ways to train the deep learning model. The first Python file trains a baseline neural network on the Iris dataset using a train/test split, feature scaling, an Adam optimiser and cross-entropy loss. The second Python file trains a separate Iris model route where hidden-size and learning-rate settings are compared before the final model is selected.</w:t>
+      </w:r>
+    </w:p>
+    <w:p>
+      <w:pPr>
+        <w:spacing w:after="120"/>
+      </w:pPr>
+      <w:r>
+        <w:t>For criterion 3.2, I demonstrate validation-set hyperparameter tuning. The Iris dataset is split into training, validation and test sets. The training set updates the model weights, the validation set compares model configurations, and the test set is kept back for final checking. The selected model is chosen using validation loss rather than only training performance.</w:t>
+      </w:r>
+    </w:p>
+    <w:p>
+      <w:pPr>
+        <w:spacing w:after="120"/>
+      </w:pPr>
+      <w:r>
+        <w:t>For criterion 3.3, I demonstrate inference using the selected trained model. A held-back Iris sample is passed into the trained network, the output logits are converted into probabilities, and the highest probability becomes the predicted Iris class. This shows that the trained model can be used after training, not just evaluated during the training loop.</w:t>
+      </w:r>
+    </w:p>
+    <w:p>
+      <w:pPr>
+        <w:spacing w:after="120"/>
+      </w:pPr>
+      <w:r>
+        <w:t>The upload pack contains the answer sheet, SS Evidence Collection, TQUK Observation Record, project notebook, Kaggle notebook, two Iris Python source files and video walkthrough. The SS Evidence Collection contains the screenshots and annotations, so the loose screenshot images do not need to be uploaded separately.</w:t>
+      </w:r>
+    </w:p>
+    <w:p>
+      <w:pPr>
+        <w:spacing w:after="120"/>
+      </w:pPr>
+      <w:r>
+        <w:t>Upload Pack Contents</w:t>
+      </w:r>
+    </w:p>
+    <w:p>
+      <w:pPr>
+        <w:spacing w:after="120"/>
+      </w:pPr>
+      <w:r>
+        <w:t>Unit 4 Assessment 5 - Answer Sheet - Rob Johnston.docx</w:t>
+      </w:r>
+    </w:p>
+    <w:p>
+      <w:pPr>
+        <w:spacing w:after="120"/>
+      </w:pPr>
+      <w:r>
+        <w:t>Unit 4 Assessment 5 - SS Evidence Collection - Rob Johnston.docx</w:t>
       </w:r>
     </w:p>
     <w:p>
       <w:r>
-        <w:t>This submission uses the Iris dataset as the assessment data source. The Iris data is loaded through sklearn.datasets.load_iris and provides four numerical input features for three target classes: setosa, versicolor and virginica. This is suitable for the assessment because it allows a small neural network to be trained, tuned and then used for a final prediction without relying on private or unrelated project data.</w:t>
-      </w:r>
-    </w:p>
-    <w:p>
-      <w:r>
-        <w:t>For criterion 3.1, I demonstrate two ways to train the deep learning model. The first Python file trains a baseline neural network on the Iris data using a train/test split, an Adam optimiser and cross-entropy loss. The second Python file trains a separate neural network route where model configurations are compared before the final model is selected. These are two training routes using the same assessment dataset, so the evidence stays focused on the task.</w:t>
-      </w:r>
-    </w:p>
-    <w:p>
-      <w:r>
-        <w:t>For criterion 3.2, I use a validation set for hyperparameter tuning. The Iris data is split into training, validation and test sets. The training set updates the model weights, the validation set compares hidden-size and learning-rate settings, and the test set is kept back for final checking. The selected model is chosen using validation loss rather than simply choosing the model that looked best during training.</w:t>
-      </w:r>
-    </w:p>
-    <w:p>
-      <w:r>
-        <w:t>For criterion 3.3, I demonstrate inference using the selected trained model. A held-back Iris sample is passed through the trained network, the output logits are converted into probabilities, and the highest probability becomes the predicted Iris class. The evidence pack includes the notebook, Python source files, screenshots, annotations, Kaggle link, GitHub link, observation record and video walkthrough.</w:t>
+        <w:t>Unit 4 Assessment 5 - TQUK Observation Record - Rob Johnston.docx</w:t>
       </w:r>
     </w:p>
     <w:p>
       <w:pPr>
-        <w:pStyle w:val="Heading2"/>
+        <w:spacing w:after="120"/>
       </w:pPr>
       <w:r>
-        <w:t>References Used</w:t>
+        <w:t>Unit 4 Assessment 5 - Project Notebook - Rob Johnston.ipynb</w:t>
       </w:r>
     </w:p>
     <w:p>
+      <w:pPr>
+        <w:spacing w:before="40" w:after="160"/>
+        <w:jc w:val="center"/>
+      </w:pPr>
       <w:r>
-        <w:t>https://scikit-learn.org/stable/modules/generated/sklearn.datasets.load_iris.html</w:t>
+        <w:t>Unit 4 Assessment 5 - Kaggle Notebook - Rob Johnston.ipynb</w:t>
       </w:r>
     </w:p>
     <w:p>
+      <w:pPr>
+        <w:spacing w:after="120"/>
+      </w:pPr>
       <w:r>
-        <w:t>https://www.kaggle.com/code/ogwebsite/unit-4-assessment-5-deep-learning-project</w:t>
+        <w:t>Unit 4 Assessment 5 - Video Walkthrough - Rob Johnston.mp4</w:t>
       </w:r>
     </w:p>
     <w:p>
-      <w:r>
-        <w:t>https://github.com/OG-Website/L3-Certificate-in-AI-Programming-with-Python/tree/main/unit-4/assessment-5-deep-learning-training-project</w:t>
-      </w:r>
-    </w:p>
-    <w:p>
+      <w:pPr>
+        <w:spacing w:after="120"/>
+      </w:pPr>
       <w:r>
         <w:t>Unit 4 Assessment 5 - Iris Training Method 1 Baseline.py</w:t>
       </w:r>
     </w:p>
     <w:p>
+      <w:pPr>
+        <w:spacing w:after="120"/>
+      </w:pPr>
       <w:r>
         <w:t>Unit 4 Assessment 5 - Iris Training Method 2 Validation Tuning Inference.py</w:t>
       </w:r>
     </w:p>
+    <w:p>
+      <w:r>
+        <w:t>References</w:t>
+      </w:r>
+    </w:p>
+    <w:p>
+      <w:pPr>
+        <w:spacing w:after="120"/>
+      </w:pPr>
+      <w:r>
+        <w:t>Kaggle notebook URL: https://www.kaggle.com/code/ogwebsite/unit-4-assessment-5-deep-learning-project</w:t>
+      </w:r>
+    </w:p>
+    <w:p>
+      <w:pPr>
+        <w:spacing w:before="40" w:after="160"/>
+        <w:jc w:val="center"/>
+      </w:pPr>
+      <w:r>
+        <w:t>GitHub assessment folder: https://github.com/OG-Website/L3-Certificate-in-AI-Programming-with-Python/tree/main/unit-4/assessment-5-deep-learning-training-project</w:t>
+      </w:r>
+    </w:p>
+    <w:p>
+      <w:pPr>
+        <w:spacing w:after="120"/>
+      </w:pPr>
+      <w:r>
+        <w:t>Iris dataset source: https://scikit-learn.org/stable/modules/generated/sklearn.datasets.load_iris.html</w:t>
+      </w:r>
+    </w:p>
+    <w:p>
+      <w:pPr>
+        <w:spacing w:after="120"/>
+      </w:pPr>
+      <w:r>
+        <w:t>Assessment criteria covered: 3.1, 3.2 and 3.3.</w:t>
+      </w:r>
+    </w:p>
+    <w:p>
+      <w:pPr>
+        <w:spacing w:after="120"/>
+      </w:pPr>
+      <w:r/>
+    </w:p>
+    <w:p>
+      <w:r/>
+    </w:p>
+    <w:p>
+      <w:pPr>
+        <w:spacing w:after="120"/>
+      </w:pPr>
+      <w:r/>
+    </w:p>
+    <w:p>
+      <w:pPr>
+        <w:spacing w:before="40" w:after="160"/>
+        <w:jc w:val="center"/>
+      </w:pPr>
+      <w:r/>
+    </w:p>
+    <w:p>
+      <w:pPr>
+        <w:spacing w:after="120"/>
+      </w:pPr>
+      <w:r/>
+    </w:p>
+    <w:p>
+      <w:pPr>
+        <w:spacing w:after="120"/>
+      </w:pPr>
+      <w:r/>
+    </w:p>
+    <w:p>
+      <w:pPr>
+        <w:spacing w:after="120"/>
+      </w:pPr>
+      <w:r/>
+    </w:p>
+    <w:p>
+      <w:pPr>
+        <w:spacing w:after="120"/>
+      </w:pPr>
+      <w:r/>
+    </w:p>
+    <w:p>
+      <w:r/>
+    </w:p>
+    <w:p>
+      <w:pPr>
+        <w:spacing w:after="120"/>
+      </w:pPr>
+      <w:r/>
+    </w:p>
+    <w:p>
+      <w:pPr>
+        <w:spacing w:before="40" w:after="160"/>
+        <w:jc w:val="center"/>
+      </w:pPr>
+      <w:r/>
+    </w:p>
+    <w:p>
+      <w:pPr>
+        <w:spacing w:after="120"/>
+      </w:pPr>
+      <w:r/>
+    </w:p>
+    <w:p>
+      <w:pPr>
+        <w:spacing w:after="120"/>
+      </w:pPr>
+      <w:r/>
+    </w:p>
+    <w:p>
+      <w:pPr>
+        <w:spacing w:after="120"/>
+      </w:pPr>
+      <w:r/>
+    </w:p>
+    <w:p>
+      <w:pPr>
+        <w:spacing w:after="120"/>
+      </w:pPr>
+      <w:r/>
+    </w:p>
+    <w:p>
+      <w:pPr>
+        <w:spacing w:after="120"/>
+      </w:pPr>
+      <w:r/>
+    </w:p>
     <w:sectPr>
+      <w:headerReference w:type="default" r:id="rId9"/>
+      <w:footerReference w:type="default" r:id="rId10"/>
       <w:pgSz w:w="12240" w:h="15840"/>
-      <w:pgMar w:top="792" w:right="864" w:bottom="792" w:left="864" w:header="720" w:footer="720" w:gutter="0"/>
+      <w:pgMar w:top="792" w:right="936" w:bottom="792" w:left="936" w:header="720" w:footer="720" w:gutter="0"/>
       <w:cols w:space="720"/>
       <w:docGrid w:linePitch="360"/>
     </w:sectPr>
   </w:body>
 </w:document>
+</file>
+
+<file path=word/footer1.xml><?xml version="1.0" encoding="utf-8"?>
+<w:ftr xmlns:m="http://schemas.openxmlformats.org/officeDocument/2006/math" xmlns:mc="http://schemas.openxmlformats.org/markup-compatibility/2006" xmlns:mo="http://schemas.microsoft.com/office/mac/office/2008/main" xmlns:mv="urn:schemas-microsoft-com:mac:vml" xmlns:o="urn:schemas-microsoft-com:office:office" xmlns:r="http://schemas.openxmlformats.org/officeDocument/2006/relationships" xmlns:v="urn:schemas-microsoft-com:vml" xmlns:w10="urn:schemas-microsoft-com:office:word" xmlns:w14="http://schemas.microsoft.com/office/word/2010/wordml" xmlns:w="http://schemas.openxmlformats.org/wordprocessingml/2006/main" xmlns:wne="http://schemas.microsoft.com/office/word/2006/wordml" xmlns:wp14="http://schemas.microsoft.com/office/word/2010/wordprocessingDrawing" xmlns:wp="http://schemas.openxmlformats.org/drawingml/2006/wordprocessingDrawing" xmlns:wpc="http://schemas.microsoft.com/office/word/2010/wordprocessingCanvas" xmlns:wpg="http://schemas.microsoft.com/office/word/2010/wordprocessingGroup" xmlns:wpi="http://schemas.microsoft.com/office/word/2010/wordprocessingInk" xmlns:wps="http://schemas.microsoft.com/office/word/2010/wordprocessingShape" mc:Ignorable="w14 wp14">
+  <w:p>
+    <w:pPr>
+      <w:pStyle w:val="Footer"/>
+      <w:jc w:val="center"/>
+    </w:pPr>
+    <w:r>
+      <w:rPr>
+        <w:rFonts w:ascii="Arial" w:hAnsi="Arial"/>
+        <w:color w:val="505050"/>
+        <w:sz w:val="16"/>
+      </w:rPr>
+      <w:t xml:space="preserve">OG Web.site | www.og-web.site | OG-Website GitHub | Page </w:t>
+    </w:r>
+  </w:p>
+</w:ftr>
+</file>
+
+<file path=word/header1.xml><?xml version="1.0" encoding="utf-8"?>
+<w:hdr xmlns:m="http://schemas.openxmlformats.org/officeDocument/2006/math" xmlns:mc="http://schemas.openxmlformats.org/markup-compatibility/2006" xmlns:mo="http://schemas.microsoft.com/office/mac/office/2008/main" xmlns:mv="urn:schemas-microsoft-com:mac:vml" xmlns:o="urn:schemas-microsoft-com:office:office" xmlns:r="http://schemas.openxmlformats.org/officeDocument/2006/relationships" xmlns:v="urn:schemas-microsoft-com:vml" xmlns:w10="urn:schemas-microsoft-com:office:word" xmlns:w14="http://schemas.microsoft.com/office/word/2010/wordml" xmlns:w="http://schemas.openxmlformats.org/wordprocessingml/2006/main" xmlns:wne="http://schemas.microsoft.com/office/word/2006/wordml" xmlns:wp14="http://schemas.microsoft.com/office/word/2010/wordprocessingDrawing" xmlns:wp="http://schemas.openxmlformats.org/drawingml/2006/wordprocessingDrawing" xmlns:wpc="http://schemas.microsoft.com/office/word/2010/wordprocessingCanvas" xmlns:wpg="http://schemas.microsoft.com/office/word/2010/wordprocessingGroup" xmlns:wpi="http://schemas.microsoft.com/office/word/2010/wordprocessingInk" xmlns:wps="http://schemas.microsoft.com/office/word/2010/wordprocessingShape" mc:Ignorable="w14 wp14">
+  <w:p>
+    <w:pPr>
+      <w:pStyle w:val="Header"/>
+      <w:jc w:val="left"/>
+    </w:pPr>
+    <w:r/>
+    <w:r>
+      <w:drawing>
+        <wp:inline xmlns:a="http://schemas.openxmlformats.org/drawingml/2006/main" xmlns:pic="http://schemas.openxmlformats.org/drawingml/2006/picture">
+          <wp:extent cx="1143000" cy="554988"/>
+          <wp:docPr id="1" name="Picture 1"/>
+          <wp:cNvGraphicFramePr>
+            <a:graphicFrameLocks noChangeAspect="1"/>
+          </wp:cNvGraphicFramePr>
+          <a:graphic>
+            <a:graphicData uri="http://schemas.openxmlformats.org/drawingml/2006/picture">
+              <pic:pic>
+                <pic:nvPicPr>
+                  <pic:cNvPr id="0" name="image.png"/>
+                  <pic:cNvPicPr/>
+                </pic:nvPicPr>
+                <pic:blipFill>
+                  <a:blip r:embed="rId2"/>
+                  <a:stretch>
+                    <a:fillRect/>
+                  </a:stretch>
+                </pic:blipFill>
+                <pic:spPr>
+                  <a:xfrm>
+                    <a:off x="0" y="0"/>
+                    <a:ext cx="1143000" cy="554988"/>
+                  </a:xfrm>
+                  <a:prstGeom prst="rect"/>
+                </pic:spPr>
+              </pic:pic>
+            </a:graphicData>
+          </a:graphic>
+        </wp:inline>
+      </w:drawing>
+    </w:r>
+    <w:r>
+      <w:rPr>
+        <w:b/>
+        <w:color w:val="06763D"/>
+      </w:rPr>
+      <w:t xml:space="preserve">   Unit 4 Assessment 5 - Answer Sheet</w:t>
+    </w:r>
+  </w:p>
+</w:hdr>
 </file>
 
 <file path=word/numbering.xml><?xml version="1.0" encoding="utf-8"?>

</xml_diff>